<commit_message>
Delivery policy draft v2 after comparing five AU shelving retailers
Co-Authored-By: Claude Sonnet 5.5 <noreply@anthropic.com>
</commit_message>
<xml_diff>
--- a/docs/policy-drafts/delivery-policy.docx
+++ b/docs/policy-drafts/delivery-policy.docx
@@ -35,7 +35,7 @@
           <w:sz w:val="20"/>
           <w:szCs w:val="20"/>
         </w:rPr>
-        <w:t xml:space="preserve">Draft for review.</w:t>
+        <w:t xml:space="preserve">Draft for review (version 2).</w:t>
       </w:r>
       <w:r>
         <w:rPr>
@@ -43,7 +43,7 @@
           <w:sz w:val="20"/>
           <w:szCs w:val="20"/>
         </w:rPr>
-        <w:t xml:space="preserve"> Written from the details already on the Super Shelving site (FAQs page). Anything in </w:t>
+        <w:t xml:space="preserve"> Written from the details already on the Super Shelving site (FAQs page, Terms and Returns Policy) and updated after comparing five Australian shelving retailers' delivery and shipping pages. Anything in </w:t>
       </w:r>
       <w:r>
         <w:rPr>
@@ -81,14 +81,7 @@
         <w:rPr>
           <w:rFonts w:ascii="Arial" w:cs="Arial" w:eastAsia="Arial" w:hAnsi="Arial"/>
         </w:rPr>
-        <w:t xml:space="preserve"> </w:t>
-      </w:r>
-      <w:r>
-        <w:rPr>
-          <w:rFonts w:ascii="Arial" w:cs="Arial" w:eastAsia="Arial" w:hAnsi="Arial"/>
-          <w:shd w:fill="FFF2B3" w:color="auto" w:val="clear"/>
-        </w:rPr>
-        <w:t xml:space="preserve">[DATE]</w:t>
+        <w:t xml:space="preserve"> 14 October 2026</w:t>
       </w:r>
     </w:p>
     <w:p>
@@ -98,6 +91,17 @@
         </w:pBdr>
         <w:spacing w:after="200" w:before="60"/>
       </w:pPr>
+    </w:p>
+    <w:p>
+      <w:pPr>
+        <w:spacing w:after="160" w:line="300"/>
+      </w:pPr>
+      <w:r>
+        <w:rPr>
+          <w:rFonts w:ascii="Arial" w:cs="Arial" w:eastAsia="Arial" w:hAnsi="Arial"/>
+        </w:rPr>
+        <w:t xml:space="preserve">At Super Shelving, we want your shelving to arrive safely and without fuss. This policy explains where we deliver, how long it takes, how pickup works, and what to do when your order arrives.</w:t>
+      </w:r>
     </w:p>
     <w:p>
       <w:pPr>
@@ -291,7 +295,21 @@
         <w:rPr>
           <w:rFonts w:ascii="Arial" w:cs="Arial" w:eastAsia="Arial" w:hAnsi="Arial"/>
         </w:rPr>
-        <w:t xml:space="preserve">Wait for your order confirmation </w:t>
+        <w:t xml:space="preserve">We will email you when your order is </w:t>
+      </w:r>
+      <w:r>
+        <w:rPr>
+          <w:rFonts w:ascii="Arial" w:cs="Arial" w:eastAsia="Arial" w:hAnsi="Arial"/>
+          <w:b/>
+          <w:bCs/>
+        </w:rPr>
+        <w:t xml:space="preserve">ready to collect</w:t>
+      </w:r>
+      <w:r>
+        <w:rPr>
+          <w:rFonts w:ascii="Arial" w:cs="Arial" w:eastAsia="Arial" w:hAnsi="Arial"/>
+        </w:rPr>
+        <w:t xml:space="preserve">. </w:t>
       </w:r>
       <w:r>
         <w:rPr>
@@ -300,13 +318,7 @@
           <w:bCs/>
           <w:shd w:fill="FFF2B3" w:color="auto" w:val="clear"/>
         </w:rPr>
-        <w:t xml:space="preserve">[CONFIRM: or "pickup ready" email]</w:t>
-      </w:r>
-      <w:r>
-        <w:rPr>
-          <w:rFonts w:ascii="Arial" w:cs="Arial" w:eastAsia="Arial" w:hAnsi="Arial"/>
-        </w:rPr>
-        <w:t xml:space="preserve">.</w:t>
+        <w:t xml:space="preserve">[CONFIRM: do you want pickup by appointment, and how long does an order take to be ready - for example 1 business day?]</w:t>
       </w:r>
     </w:p>
     <w:p>
@@ -322,7 +334,37 @@
         <w:rPr>
           <w:rFonts w:ascii="Arial" w:cs="Arial" w:eastAsia="Arial" w:hAnsi="Arial"/>
         </w:rPr>
-        <w:t xml:space="preserve">Bring your order number when you arrive. </w:t>
+        <w:t xml:space="preserve">Bring a copy of your </w:t>
+      </w:r>
+      <w:r>
+        <w:rPr>
+          <w:rFonts w:ascii="Arial" w:cs="Arial" w:eastAsia="Arial" w:hAnsi="Arial"/>
+          <w:b/>
+          <w:bCs/>
+        </w:rPr>
+        <w:t xml:space="preserve">order confirmation</w:t>
+      </w:r>
+      <w:r>
+        <w:rPr>
+          <w:rFonts w:ascii="Arial" w:cs="Arial" w:eastAsia="Arial" w:hAnsi="Arial"/>
+        </w:rPr>
+        <w:t xml:space="preserve"> or your order number when you arrive.</w:t>
+      </w:r>
+    </w:p>
+    <w:p>
+      <w:pPr>
+        <w:pStyle w:val="ListParagraph"/>
+        <w:numPr>
+          <w:ilvl w:val="0"/>
+          <w:numId w:val="2"/>
+        </w:numPr>
+        <w:spacing w:after="100" w:line="300"/>
+      </w:pPr>
+      <w:r>
+        <w:rPr>
+          <w:rFonts w:ascii="Arial" w:cs="Arial" w:eastAsia="Arial" w:hAnsi="Arial"/>
+        </w:rPr>
+        <w:t xml:space="preserve">If someone else is collecting for you, they will need your order number. </w:t>
       </w:r>
       <w:r>
         <w:rPr>
@@ -331,18 +373,43 @@
           <w:bCs/>
           <w:shd w:fill="FFF2B3" w:color="auto" w:val="clear"/>
         </w:rPr>
-        <w:t xml:space="preserve">[CONFIRM: photo ID required?]</w:t>
-      </w:r>
-    </w:p>
-    <w:p>
-      <w:pPr>
-        <w:spacing w:after="160" w:line="300"/>
-      </w:pPr>
-      <w:r>
-        <w:rPr>
-          <w:rFonts w:ascii="Arial" w:cs="Arial" w:eastAsia="Arial" w:hAnsi="Arial"/>
-        </w:rPr>
-        <w:t xml:space="preserve">Your shelving is packed flat in boxes. Our How To Collect In Your Vehicle guide shows boxed sizes and weights so you can check your vehicle first. </w:t>
+        <w:t xml:space="preserve">[CONFIRM: any ID requirement?]</w:t>
+      </w:r>
+    </w:p>
+    <w:p>
+      <w:pPr>
+        <w:spacing w:after="160" w:line="300"/>
+      </w:pPr>
+      <w:r>
+        <w:rPr>
+          <w:rFonts w:ascii="Arial" w:cs="Arial" w:eastAsia="Arial" w:hAnsi="Arial"/>
+        </w:rPr>
+        <w:t xml:space="preserve">If you arranged to pay by </w:t>
+      </w:r>
+      <w:r>
+        <w:rPr>
+          <w:rFonts w:ascii="Arial" w:cs="Arial" w:eastAsia="Arial" w:hAnsi="Arial"/>
+          <w:b/>
+          <w:bCs/>
+        </w:rPr>
+        <w:t xml:space="preserve">bank transfer, PayID or cash</w:t>
+      </w:r>
+      <w:r>
+        <w:rPr>
+          <w:rFonts w:ascii="Arial" w:cs="Arial" w:eastAsia="Arial" w:hAnsi="Arial"/>
+        </w:rPr>
+        <w:t xml:space="preserve"> for a pickup order, you pay in person at our pickup location when you collect.</w:t>
+      </w:r>
+    </w:p>
+    <w:p>
+      <w:pPr>
+        <w:spacing w:after="160" w:line="300"/>
+      </w:pPr>
+      <w:r>
+        <w:rPr>
+          <w:rFonts w:ascii="Arial" w:cs="Arial" w:eastAsia="Arial" w:hAnsi="Arial"/>
+        </w:rPr>
+        <w:t xml:space="preserve">Your shelving is packed flat in boxes. Our How To Collect In Your Vehicle guide shows boxed sizes and weights so you can check your vehicle first. You are also welcome to send your own courier to collect your order. Please contact us in advance so we can arrange it. </w:t>
       </w:r>
       <w:r>
         <w:rPr>
@@ -351,7 +418,7 @@
           <w:bCs/>
           <w:shd w:fill="FFF2B3" w:color="auto" w:val="clear"/>
         </w:rPr>
-        <w:t xml:space="preserve">[CONFIRM: pickup hold time before orders are returned to stock, e.g. 7 days.]</w:t>
+        <w:t xml:space="preserve">[CONFIRM: how long you hold pickup orders before they go back to stock, for example 14 days.]</w:t>
       </w:r>
     </w:p>
     <w:p>
@@ -449,45 +516,6 @@
     </w:p>
     <w:p>
       <w:pPr>
-        <w:spacing w:after="160" w:line="300"/>
-      </w:pPr>
-      <w:r>
-        <w:rPr>
-          <w:rFonts w:ascii="Arial" w:cs="Arial" w:eastAsia="Arial" w:hAnsi="Arial"/>
-        </w:rPr>
-        <w:t xml:space="preserve">These times are estimates, not guarantees. Delays can happen because of stock, weather, public holidays, courier issues or other events outside our control. We will contact you if we expect a significant delay.</w:t>
-      </w:r>
-    </w:p>
-    <w:p>
-      <w:pPr>
-        <w:pStyle w:val="Heading2"/>
-        <w:keepNext/>
-        <w:spacing w:after="120" w:before="280"/>
-      </w:pPr>
-      <w:r>
-        <w:rPr>
-          <w:rFonts w:ascii="Arial" w:cs="Arial" w:eastAsia="Arial" w:hAnsi="Arial"/>
-          <w:b/>
-          <w:bCs/>
-          <w:sz w:val="26"/>
-          <w:szCs w:val="26"/>
-        </w:rPr>
-        <w:t xml:space="preserve">4. How your order is delivered</w:t>
-      </w:r>
-    </w:p>
-    <w:p>
-      <w:pPr>
-        <w:spacing w:after="160" w:line="300"/>
-      </w:pPr>
-      <w:r>
-        <w:rPr>
-          <w:rFonts w:ascii="Arial" w:cs="Arial" w:eastAsia="Arial" w:hAnsi="Arial"/>
-        </w:rPr>
-        <w:t xml:space="preserve">Your order is delivered in one of two ways, whichever is cheaper:</w:t>
-      </w:r>
-    </w:p>
-    <w:p>
-      <w:pPr>
         <w:pStyle w:val="ListParagraph"/>
         <w:numPr>
           <w:ilvl w:val="0"/>
@@ -498,30 +526,81 @@
       <w:r>
         <w:rPr>
           <w:rFonts w:ascii="Arial" w:cs="Arial" w:eastAsia="Arial" w:hAnsi="Arial"/>
-          <w:b/>
-          <w:bCs/>
-        </w:rPr>
-        <w:t xml:space="preserve">Courier</w:t>
-      </w:r>
-      <w:r>
-        <w:rPr>
-          <w:rFonts w:ascii="Arial" w:cs="Arial" w:eastAsia="Arial" w:hAnsi="Arial"/>
-        </w:rPr>
-        <w:t xml:space="preserve"> - picked up from our warehouse and delivered to you by </w:t>
-      </w:r>
-      <w:r>
-        <w:rPr>
-          <w:rFonts w:ascii="Arial" w:cs="Arial" w:eastAsia="Arial" w:hAnsi="Arial"/>
-          <w:b/>
-          <w:bCs/>
-        </w:rPr>
-        <w:t xml:space="preserve">Aramex</w:t>
-      </w:r>
-      <w:r>
-        <w:rPr>
-          <w:rFonts w:ascii="Arial" w:cs="Arial" w:eastAsia="Arial" w:hAnsi="Arial"/>
-        </w:rPr>
-        <w:t xml:space="preserve">.</w:t>
+        </w:rPr>
+        <w:t xml:space="preserve">During busy periods, sales or public holidays, dispatch may take longer.</w:t>
+      </w:r>
+    </w:p>
+    <w:p>
+      <w:pPr>
+        <w:spacing w:after="160" w:line="300"/>
+      </w:pPr>
+      <w:r>
+        <w:rPr>
+          <w:rFonts w:ascii="Arial" w:cs="Arial" w:eastAsia="Arial" w:hAnsi="Arial"/>
+        </w:rPr>
+        <w:t xml:space="preserve">These times are estimates, not guarantees. Delays can happen because of stock, weather, public holidays, courier issues or other events outside our control. We will contact you if we expect a significant delay.</w:t>
+      </w:r>
+    </w:p>
+    <w:p>
+      <w:pPr>
+        <w:spacing w:after="160" w:line="300"/>
+      </w:pPr>
+      <w:r>
+        <w:rPr>
+          <w:rFonts w:ascii="Arial" w:cs="Arial" w:eastAsia="Arial" w:hAnsi="Arial"/>
+        </w:rPr>
+        <w:t xml:space="preserve">We will try to meet any delivery time you ask for, but we </w:t>
+      </w:r>
+      <w:r>
+        <w:rPr>
+          <w:rFonts w:ascii="Arial" w:cs="Arial" w:eastAsia="Arial" w:hAnsi="Arial"/>
+          <w:b/>
+          <w:bCs/>
+        </w:rPr>
+        <w:t xml:space="preserve">cannot guarantee a specific day, time or time slot</w:t>
+      </w:r>
+      <w:r>
+        <w:rPr>
+          <w:rFonts w:ascii="Arial" w:cs="Arial" w:eastAsia="Arial" w:hAnsi="Arial"/>
+        </w:rPr>
+        <w:t xml:space="preserve"> unless we have confirmed it in writing. </w:t>
+      </w:r>
+      <w:r>
+        <w:rPr>
+          <w:rFonts w:ascii="Arial" w:cs="Arial" w:eastAsia="Arial" w:hAnsi="Arial"/>
+          <w:b/>
+          <w:bCs/>
+          <w:shd w:fill="FFF2B3" w:color="auto" w:val="clear"/>
+        </w:rPr>
+        <w:t xml:space="preserve">[CONFIRM: whether you offer a booked time slot for an extra fee.]</w:t>
+      </w:r>
+    </w:p>
+    <w:p>
+      <w:pPr>
+        <w:pStyle w:val="Heading2"/>
+        <w:keepNext/>
+        <w:spacing w:after="120" w:before="280"/>
+      </w:pPr>
+      <w:r>
+        <w:rPr>
+          <w:rFonts w:ascii="Arial" w:cs="Arial" w:eastAsia="Arial" w:hAnsi="Arial"/>
+          <w:b/>
+          <w:bCs/>
+          <w:sz w:val="26"/>
+          <w:szCs w:val="26"/>
+        </w:rPr>
+        <w:t xml:space="preserve">4. How your order is delivered</w:t>
+      </w:r>
+    </w:p>
+    <w:p>
+      <w:pPr>
+        <w:spacing w:after="160" w:line="300"/>
+      </w:pPr>
+      <w:r>
+        <w:rPr>
+          <w:rFonts w:ascii="Arial" w:cs="Arial" w:eastAsia="Arial" w:hAnsi="Arial"/>
+        </w:rPr>
+        <w:t xml:space="preserve">Your order is delivered in one of two ways, whichever is cheaper:</w:t>
       </w:r>
     </w:p>
     <w:p>
@@ -539,140 +618,27 @@
           <w:b/>
           <w:bCs/>
         </w:rPr>
-        <w:t xml:space="preserve">In-house delivery</w:t>
-      </w:r>
-      <w:r>
-        <w:rPr>
-          <w:rFonts w:ascii="Arial" w:cs="Arial" w:eastAsia="Arial" w:hAnsi="Arial"/>
-        </w:rPr>
-        <w:t xml:space="preserve"> - delivered from our warehouse in our own vans or trucks.</w:t>
-      </w:r>
-    </w:p>
-    <w:p>
-      <w:pPr>
-        <w:spacing w:after="160" w:line="300"/>
-      </w:pPr>
-      <w:r>
-        <w:rPr>
-          <w:rFonts w:ascii="Arial" w:cs="Arial" w:eastAsia="Arial" w:hAnsi="Arial"/>
-        </w:rPr>
-        <w:t xml:space="preserve">We choose the delivery method. You will not be able to choose between them.</w:t>
-      </w:r>
-    </w:p>
-    <w:p>
-      <w:pPr>
-        <w:pStyle w:val="Heading2"/>
-        <w:keepNext/>
-        <w:spacing w:after="120" w:before="280"/>
-      </w:pPr>
-      <w:r>
-        <w:rPr>
-          <w:rFonts w:ascii="Arial" w:cs="Arial" w:eastAsia="Arial" w:hAnsi="Arial"/>
-          <w:b/>
-          <w:bCs/>
-          <w:sz w:val="26"/>
-          <w:szCs w:val="26"/>
-        </w:rPr>
-        <w:t xml:space="preserve">5. Delivery costs</w:t>
-      </w:r>
-    </w:p>
-    <w:p>
-      <w:pPr>
-        <w:spacing w:after="160" w:line="300"/>
-      </w:pPr>
-      <w:r>
-        <w:rPr>
-          <w:rFonts w:ascii="Arial" w:cs="Arial" w:eastAsia="Arial" w:hAnsi="Arial"/>
-        </w:rPr>
-        <w:t xml:space="preserve">Delivery is calculated at checkout based on your </w:t>
-      </w:r>
-      <w:r>
-        <w:rPr>
-          <w:rFonts w:ascii="Arial" w:cs="Arial" w:eastAsia="Arial" w:hAnsi="Arial"/>
-          <w:b/>
-          <w:bCs/>
-        </w:rPr>
-        <w:t xml:space="preserve">postcode</w:t>
-      </w:r>
-      <w:r>
-        <w:rPr>
-          <w:rFonts w:ascii="Arial" w:cs="Arial" w:eastAsia="Arial" w:hAnsi="Arial"/>
-        </w:rPr>
-        <w:t xml:space="preserve"> and the </w:t>
-      </w:r>
-      <w:r>
-        <w:rPr>
-          <w:rFonts w:ascii="Arial" w:cs="Arial" w:eastAsia="Arial" w:hAnsi="Arial"/>
-          <w:b/>
-          <w:bCs/>
-        </w:rPr>
-        <w:t xml:space="preserve">items and quantity</w:t>
-      </w:r>
-      <w:r>
-        <w:rPr>
-          <w:rFonts w:ascii="Arial" w:cs="Arial" w:eastAsia="Arial" w:hAnsi="Arial"/>
-        </w:rPr>
-        <w:t xml:space="preserve"> you order. Some items ship for as little as $9.99, but most orders fall between </w:t>
-      </w:r>
-      <w:r>
-        <w:rPr>
-          <w:rFonts w:ascii="Arial" w:cs="Arial" w:eastAsia="Arial" w:hAnsi="Arial"/>
-          <w:b/>
-          <w:bCs/>
-        </w:rPr>
-        <w:t xml:space="preserve">$50 and $100</w:t>
-      </w:r>
-      <w:r>
-        <w:rPr>
-          <w:rFonts w:ascii="Arial" w:cs="Arial" w:eastAsia="Arial" w:hAnsi="Arial"/>
-        </w:rPr>
-        <w:t xml:space="preserve">. </w:t>
-      </w:r>
-      <w:r>
-        <w:rPr>
-          <w:rFonts w:ascii="Arial" w:cs="Arial" w:eastAsia="Arial" w:hAnsi="Arial"/>
-          <w:b/>
-          <w:bCs/>
-          <w:shd w:fill="FFF2B3" w:color="auto" w:val="clear"/>
-        </w:rPr>
-        <w:t xml:space="preserve">[CONFIRM current range.]</w:t>
-      </w:r>
-    </w:p>
-    <w:p>
-      <w:pPr>
-        <w:spacing w:after="160" w:line="300"/>
-      </w:pPr>
-      <w:r>
-        <w:rPr>
-          <w:rFonts w:ascii="Arial" w:cs="Arial" w:eastAsia="Arial" w:hAnsi="Arial"/>
-        </w:rPr>
-        <w:t xml:space="preserve">The delivery cost is shown before you pay. </w:t>
-      </w:r>
-      <w:r>
-        <w:rPr>
-          <w:rFonts w:ascii="Arial" w:cs="Arial" w:eastAsia="Arial" w:hAnsi="Arial"/>
-          <w:b/>
-          <w:bCs/>
-          <w:shd w:fill="FFF2B3" w:color="auto" w:val="clear"/>
-        </w:rPr>
-        <w:t xml:space="preserve">[CONFIRM: any free-delivery threshold, remote-area surcharge or extra charge for large orders.]</w:t>
-      </w:r>
-    </w:p>
-    <w:p>
-      <w:pPr>
-        <w:pStyle w:val="Heading2"/>
-        <w:keepNext/>
-        <w:spacing w:after="120" w:before="280"/>
-      </w:pPr>
-      <w:r>
-        <w:rPr>
-          <w:rFonts w:ascii="Arial" w:cs="Arial" w:eastAsia="Arial" w:hAnsi="Arial"/>
-          <w:b/>
-          <w:bCs/>
-          <w:sz w:val="26"/>
-          <w:szCs w:val="26"/>
-        </w:rPr>
-        <w:t xml:space="preserve">6. Delivery address and receiving your order</w:t>
+        <w:t xml:space="preserve">Courier</w:t>
+      </w:r>
+      <w:r>
+        <w:rPr>
+          <w:rFonts w:ascii="Arial" w:cs="Arial" w:eastAsia="Arial" w:hAnsi="Arial"/>
+        </w:rPr>
+        <w:t xml:space="preserve"> - picked up from our warehouse and delivered to you by </w:t>
+      </w:r>
+      <w:r>
+        <w:rPr>
+          <w:rFonts w:ascii="Arial" w:cs="Arial" w:eastAsia="Arial" w:hAnsi="Arial"/>
+          <w:b/>
+          <w:bCs/>
+        </w:rPr>
+        <w:t xml:space="preserve">Aramex</w:t>
+      </w:r>
+      <w:r>
+        <w:rPr>
+          <w:rFonts w:ascii="Arial" w:cs="Arial" w:eastAsia="Arial" w:hAnsi="Arial"/>
+        </w:rPr>
+        <w:t xml:space="preserve">.</w:t>
       </w:r>
     </w:p>
     <w:p>
@@ -687,22 +653,184 @@
       <w:r>
         <w:rPr>
           <w:rFonts w:ascii="Arial" w:cs="Arial" w:eastAsia="Arial" w:hAnsi="Arial"/>
-        </w:rPr>
-        <w:t xml:space="preserve">Please give us a </w:t>
-      </w:r>
-      <w:r>
-        <w:rPr>
-          <w:rFonts w:ascii="Arial" w:cs="Arial" w:eastAsia="Arial" w:hAnsi="Arial"/>
-          <w:b/>
-          <w:bCs/>
-        </w:rPr>
-        <w:t xml:space="preserve">complete and accurate address</w:t>
-      </w:r>
-      <w:r>
-        <w:rPr>
-          <w:rFonts w:ascii="Arial" w:cs="Arial" w:eastAsia="Arial" w:hAnsi="Arial"/>
-        </w:rPr>
-        <w:t xml:space="preserve">, with a phone number we can reach on delivery day.</w:t>
+          <w:b/>
+          <w:bCs/>
+        </w:rPr>
+        <w:t xml:space="preserve">In-house delivery</w:t>
+      </w:r>
+      <w:r>
+        <w:rPr>
+          <w:rFonts w:ascii="Arial" w:cs="Arial" w:eastAsia="Arial" w:hAnsi="Arial"/>
+        </w:rPr>
+        <w:t xml:space="preserve"> - delivered from our warehouse in our own vans or trucks.</w:t>
+      </w:r>
+    </w:p>
+    <w:p>
+      <w:pPr>
+        <w:spacing w:after="160" w:line="300"/>
+      </w:pPr>
+      <w:r>
+        <w:rPr>
+          <w:rFonts w:ascii="Arial" w:cs="Arial" w:eastAsia="Arial" w:hAnsi="Arial"/>
+        </w:rPr>
+        <w:t xml:space="preserve">We choose the delivery method. You will not be able to choose between them.</w:t>
+      </w:r>
+    </w:p>
+    <w:p>
+      <w:pPr>
+        <w:spacing w:after="160" w:line="300"/>
+      </w:pPr>
+      <w:r>
+        <w:rPr>
+          <w:rFonts w:ascii="Arial" w:cs="Arial" w:eastAsia="Arial" w:hAnsi="Arial"/>
+        </w:rPr>
+        <w:t xml:space="preserve">Once your order is dispatched, we will send you </w:t>
+      </w:r>
+      <w:r>
+        <w:rPr>
+          <w:rFonts w:ascii="Arial" w:cs="Arial" w:eastAsia="Arial" w:hAnsi="Arial"/>
+          <w:b/>
+          <w:bCs/>
+        </w:rPr>
+        <w:t xml:space="preserve">tracking details</w:t>
+      </w:r>
+      <w:r>
+        <w:rPr>
+          <w:rFonts w:ascii="Arial" w:cs="Arial" w:eastAsia="Arial" w:hAnsi="Arial"/>
+        </w:rPr>
+        <w:t xml:space="preserve"> by email. Please keep them. If something goes wrong, contact the courier with your tracking number and let us know straight away so we can help follow it up.</w:t>
+      </w:r>
+    </w:p>
+    <w:p>
+      <w:pPr>
+        <w:pStyle w:val="Heading2"/>
+        <w:keepNext/>
+        <w:spacing w:after="120" w:before="280"/>
+      </w:pPr>
+      <w:r>
+        <w:rPr>
+          <w:rFonts w:ascii="Arial" w:cs="Arial" w:eastAsia="Arial" w:hAnsi="Arial"/>
+          <w:b/>
+          <w:bCs/>
+          <w:sz w:val="26"/>
+          <w:szCs w:val="26"/>
+        </w:rPr>
+        <w:t xml:space="preserve">5. Delivery costs</w:t>
+      </w:r>
+    </w:p>
+    <w:p>
+      <w:pPr>
+        <w:spacing w:after="160" w:line="300"/>
+      </w:pPr>
+      <w:r>
+        <w:rPr>
+          <w:rFonts w:ascii="Arial" w:cs="Arial" w:eastAsia="Arial" w:hAnsi="Arial"/>
+        </w:rPr>
+        <w:t xml:space="preserve">Delivery is calculated at checkout based on your </w:t>
+      </w:r>
+      <w:r>
+        <w:rPr>
+          <w:rFonts w:ascii="Arial" w:cs="Arial" w:eastAsia="Arial" w:hAnsi="Arial"/>
+          <w:b/>
+          <w:bCs/>
+        </w:rPr>
+        <w:t xml:space="preserve">postcode</w:t>
+      </w:r>
+      <w:r>
+        <w:rPr>
+          <w:rFonts w:ascii="Arial" w:cs="Arial" w:eastAsia="Arial" w:hAnsi="Arial"/>
+        </w:rPr>
+        <w:t xml:space="preserve"> and the </w:t>
+      </w:r>
+      <w:r>
+        <w:rPr>
+          <w:rFonts w:ascii="Arial" w:cs="Arial" w:eastAsia="Arial" w:hAnsi="Arial"/>
+          <w:b/>
+          <w:bCs/>
+        </w:rPr>
+        <w:t xml:space="preserve">items and quantity</w:t>
+      </w:r>
+      <w:r>
+        <w:rPr>
+          <w:rFonts w:ascii="Arial" w:cs="Arial" w:eastAsia="Arial" w:hAnsi="Arial"/>
+        </w:rPr>
+        <w:t xml:space="preserve"> you order. The cost is shown before you pay.</w:t>
+      </w:r>
+    </w:p>
+    <w:p>
+      <w:pPr>
+        <w:spacing w:after="160" w:line="300"/>
+      </w:pPr>
+      <w:r>
+        <w:rPr>
+          <w:rFonts w:ascii="Arial" w:cs="Arial" w:eastAsia="Arial" w:hAnsi="Arial"/>
+        </w:rPr>
+        <w:t xml:space="preserve">Some larger or heavier orders, or addresses that are hard to reach, may cost more to deliver than the checkout shows. If that happens, we will contact you </w:t>
+      </w:r>
+      <w:r>
+        <w:rPr>
+          <w:rFonts w:ascii="Arial" w:cs="Arial" w:eastAsia="Arial" w:hAnsi="Arial"/>
+          <w:b/>
+          <w:bCs/>
+        </w:rPr>
+        <w:t xml:space="preserve">within 2 business days</w:t>
+      </w:r>
+      <w:r>
+        <w:rPr>
+          <w:rFonts w:ascii="Arial" w:cs="Arial" w:eastAsia="Arial" w:hAnsi="Arial"/>
+        </w:rPr>
+        <w:t xml:space="preserve"> to discuss. You can accept the extra cost or cancel for a full refund. </w:t>
+      </w:r>
+      <w:r>
+        <w:rPr>
+          <w:rFonts w:ascii="Arial" w:cs="Arial" w:eastAsia="Arial" w:hAnsi="Arial"/>
+          <w:b/>
+          <w:bCs/>
+          <w:shd w:fill="FFF2B3" w:color="auto" w:val="clear"/>
+        </w:rPr>
+        <w:t xml:space="preserve">[CONFIRM: this is borrowed from another retailer's approach - keep it only if you want it.]</w:t>
+      </w:r>
+    </w:p>
+    <w:p>
+      <w:pPr>
+        <w:spacing w:after="160" w:line="300"/>
+      </w:pPr>
+      <w:r>
+        <w:rPr>
+          <w:rFonts w:ascii="Arial" w:cs="Arial" w:eastAsia="Arial" w:hAnsi="Arial"/>
+        </w:rPr>
+        <w:t xml:space="preserve">For </w:t>
+      </w:r>
+      <w:r>
+        <w:rPr>
+          <w:rFonts w:ascii="Arial" w:cs="Arial" w:eastAsia="Arial" w:hAnsi="Arial"/>
+          <w:b/>
+          <w:bCs/>
+        </w:rPr>
+        <w:t xml:space="preserve">large or bulk orders</w:t>
+      </w:r>
+      <w:r>
+        <w:rPr>
+          <w:rFonts w:ascii="Arial" w:cs="Arial" w:eastAsia="Arial" w:hAnsi="Arial"/>
+        </w:rPr>
+        <w:t xml:space="preserve">, please contact us before you order and we can give you a freight quote.</w:t>
+      </w:r>
+    </w:p>
+    <w:p>
+      <w:pPr>
+        <w:pStyle w:val="Heading2"/>
+        <w:keepNext/>
+        <w:spacing w:after="120" w:before="280"/>
+      </w:pPr>
+      <w:r>
+        <w:rPr>
+          <w:rFonts w:ascii="Arial" w:cs="Arial" w:eastAsia="Arial" w:hAnsi="Arial"/>
+          <w:b/>
+          <w:bCs/>
+          <w:sz w:val="26"/>
+          <w:szCs w:val="26"/>
+        </w:rPr>
+        <w:t xml:space="preserve">6. Where we deliver to, and receiving your order</w:t>
       </w:r>
     </w:p>
     <w:p>
@@ -718,31 +846,21 @@
         <w:rPr>
           <w:rFonts w:ascii="Arial" w:cs="Arial" w:eastAsia="Arial" w:hAnsi="Arial"/>
         </w:rPr>
-        <w:t xml:space="preserve">We deliver to </w:t>
-      </w:r>
-      <w:r>
-        <w:rPr>
-          <w:rFonts w:ascii="Arial" w:cs="Arial" w:eastAsia="Arial" w:hAnsi="Arial"/>
-          <w:b/>
-          <w:bCs/>
-          <w:shd w:fill="FFF2B3" w:color="auto" w:val="clear"/>
-        </w:rPr>
-        <w:t xml:space="preserve">[the front door / the kerbside / the first accessible point]</w:t>
-      </w:r>
-      <w:r>
-        <w:rPr>
-          <w:rFonts w:ascii="Arial" w:cs="Arial" w:eastAsia="Arial" w:hAnsi="Arial"/>
-        </w:rPr>
-        <w:t xml:space="preserve"> at your address. </w:t>
-      </w:r>
-      <w:r>
-        <w:rPr>
-          <w:rFonts w:ascii="Arial" w:cs="Arial" w:eastAsia="Arial" w:hAnsi="Arial"/>
-          <w:b/>
-          <w:bCs/>
-          <w:shd w:fill="FFF2B3" w:color="auto" w:val="clear"/>
-        </w:rPr>
-        <w:t xml:space="preserve">[CONFIRM: carry-in or placement inside the property is / is not included.]</w:t>
+        <w:t xml:space="preserve">Please give us a </w:t>
+      </w:r>
+      <w:r>
+        <w:rPr>
+          <w:rFonts w:ascii="Arial" w:cs="Arial" w:eastAsia="Arial" w:hAnsi="Arial"/>
+          <w:b/>
+          <w:bCs/>
+        </w:rPr>
+        <w:t xml:space="preserve">complete and accurate address</w:t>
+      </w:r>
+      <w:r>
+        <w:rPr>
+          <w:rFonts w:ascii="Arial" w:cs="Arial" w:eastAsia="Arial" w:hAnsi="Arial"/>
+        </w:rPr>
+        <w:t xml:space="preserve">, and a phone number we can reach on delivery day.</w:t>
       </w:r>
     </w:p>
     <w:p>
@@ -758,7 +876,44 @@
         <w:rPr>
           <w:rFonts w:ascii="Arial" w:cs="Arial" w:eastAsia="Arial" w:hAnsi="Arial"/>
         </w:rPr>
-        <w:t xml:space="preserve">Shelving is heavy and bulky. Please make sure someone is available to receive and move it.</w:t>
+        <w:t xml:space="preserve">Deliveries go to the </w:t>
+      </w:r>
+      <w:r>
+        <w:rPr>
+          <w:rFonts w:ascii="Arial" w:cs="Arial" w:eastAsia="Arial" w:hAnsi="Arial"/>
+          <w:b/>
+          <w:bCs/>
+        </w:rPr>
+        <w:t xml:space="preserve">front door, garage, or ground floor or kerbside</w:t>
+      </w:r>
+      <w:r>
+        <w:rPr>
+          <w:rFonts w:ascii="Arial" w:cs="Arial" w:eastAsia="Arial" w:hAnsi="Arial"/>
+        </w:rPr>
+        <w:t xml:space="preserve"> of your address. </w:t>
+      </w:r>
+      <w:r>
+        <w:rPr>
+          <w:rFonts w:ascii="Arial" w:cs="Arial" w:eastAsia="Arial" w:hAnsi="Arial"/>
+          <w:b/>
+          <w:bCs/>
+        </w:rPr>
+        <w:t xml:space="preserve">We do not carry items upstairs, downstairs or inside</w:t>
+      </w:r>
+      <w:r>
+        <w:rPr>
+          <w:rFonts w:ascii="Arial" w:cs="Arial" w:eastAsia="Arial" w:hAnsi="Arial"/>
+        </w:rPr>
+        <w:t xml:space="preserve"> your home or business. </w:t>
+      </w:r>
+      <w:r>
+        <w:rPr>
+          <w:rFonts w:ascii="Arial" w:cs="Arial" w:eastAsia="Arial" w:hAnsi="Arial"/>
+          <w:b/>
+          <w:bCs/>
+          <w:shd w:fill="FFF2B3" w:color="auto" w:val="clear"/>
+        </w:rPr>
+        <w:t xml:space="preserve">[CONFIRM: or add "unless arranged in advance for an extra fee".]</w:t>
       </w:r>
     </w:p>
     <w:p>
@@ -774,65 +929,7 @@
         <w:rPr>
           <w:rFonts w:ascii="Arial" w:cs="Arial" w:eastAsia="Arial" w:hAnsi="Arial"/>
         </w:rPr>
-        <w:t xml:space="preserve">If nobody is home, the courier may leave the order in a safe place if the carrier's authority-to-leave option applies, or attempt redelivery. </w:t>
-      </w:r>
-      <w:r>
-        <w:rPr>
-          <w:rFonts w:ascii="Arial" w:cs="Arial" w:eastAsia="Arial" w:hAnsi="Arial"/>
-          <w:b/>
-          <w:bCs/>
-          <w:shd w:fill="FFF2B3" w:color="auto" w:val="clear"/>
-        </w:rPr>
-        <w:t xml:space="preserve">[CONFIRM.]</w:t>
-      </w:r>
-      <w:r>
-        <w:rPr>
-          <w:rFonts w:ascii="Arial" w:cs="Arial" w:eastAsia="Arial" w:hAnsi="Arial"/>
-        </w:rPr>
-        <w:t xml:space="preserve"> If a delivery fails because of an incorrect address or no one being available, </w:t>
-      </w:r>
-      <w:r>
-        <w:rPr>
-          <w:rFonts w:ascii="Arial" w:cs="Arial" w:eastAsia="Arial" w:hAnsi="Arial"/>
-          <w:b/>
-          <w:bCs/>
-          <w:shd w:fill="FFF2B3" w:color="auto" w:val="clear"/>
-        </w:rPr>
-        <w:t xml:space="preserve">[extra redelivery charges may apply]</w:t>
-      </w:r>
-      <w:r>
-        <w:rPr>
-          <w:rFonts w:ascii="Arial" w:cs="Arial" w:eastAsia="Arial" w:hAnsi="Arial"/>
-        </w:rPr>
-        <w:t xml:space="preserve">.</w:t>
-      </w:r>
-    </w:p>
-    <w:p>
-      <w:pPr>
-        <w:pStyle w:val="Heading2"/>
-        <w:keepNext/>
-        <w:spacing w:after="120" w:before="280"/>
-      </w:pPr>
-      <w:r>
-        <w:rPr>
-          <w:rFonts w:ascii="Arial" w:cs="Arial" w:eastAsia="Arial" w:hAnsi="Arial"/>
-          <w:b/>
-          <w:bCs/>
-          <w:sz w:val="26"/>
-          <w:szCs w:val="26"/>
-        </w:rPr>
-        <w:t xml:space="preserve">7. Check your order on arrival</w:t>
-      </w:r>
-    </w:p>
-    <w:p>
-      <w:pPr>
-        <w:spacing w:after="160" w:line="300"/>
-      </w:pPr>
-      <w:r>
-        <w:rPr>
-          <w:rFonts w:ascii="Arial" w:cs="Arial" w:eastAsia="Arial" w:hAnsi="Arial"/>
-        </w:rPr>
-        <w:t xml:space="preserve">Please check your order when it arrives:</w:t>
+        <w:t xml:space="preserve">Shelving is heavy and bulky. Please make sure someone is available to receive and help move it.</w:t>
       </w:r>
     </w:p>
     <w:p>
@@ -848,21 +945,21 @@
         <w:rPr>
           <w:rFonts w:ascii="Arial" w:cs="Arial" w:eastAsia="Arial" w:hAnsi="Arial"/>
         </w:rPr>
-        <w:t xml:space="preserve">Look over the outside of the boxes for damage </w:t>
-      </w:r>
-      <w:r>
-        <w:rPr>
-          <w:rFonts w:ascii="Arial" w:cs="Arial" w:eastAsia="Arial" w:hAnsi="Arial"/>
-          <w:b/>
-          <w:bCs/>
-        </w:rPr>
-        <w:t xml:space="preserve">before</w:t>
-      </w:r>
-      <w:r>
-        <w:rPr>
-          <w:rFonts w:ascii="Arial" w:cs="Arial" w:eastAsia="Arial" w:hAnsi="Arial"/>
-        </w:rPr>
-        <w:t xml:space="preserve"> the courier leaves where you can. Take photos.</w:t>
+        <w:t xml:space="preserve">You are responsible for </w:t>
+      </w:r>
+      <w:r>
+        <w:rPr>
+          <w:rFonts w:ascii="Arial" w:cs="Arial" w:eastAsia="Arial" w:hAnsi="Arial"/>
+          <w:b/>
+          <w:bCs/>
+        </w:rPr>
+        <w:t xml:space="preserve">disposing of the pallets and packaging</w:t>
+      </w:r>
+      <w:r>
+        <w:rPr>
+          <w:rFonts w:ascii="Arial" w:cs="Arial" w:eastAsia="Arial" w:hAnsi="Arial"/>
+        </w:rPr>
+        <w:t xml:space="preserve">.</w:t>
       </w:r>
     </w:p>
     <w:p>
@@ -878,22 +975,35 @@
         <w:rPr>
           <w:rFonts w:ascii="Arial" w:cs="Arial" w:eastAsia="Arial" w:hAnsi="Arial"/>
         </w:rPr>
-        <w:t xml:space="preserve">Open the boxes and check you have received everything </w:t>
-      </w:r>
-      <w:r>
-        <w:rPr>
-          <w:rFonts w:ascii="Arial" w:cs="Arial" w:eastAsia="Arial" w:hAnsi="Arial"/>
-          <w:b/>
-          <w:bCs/>
-          <w:shd w:fill="FFF2B3" w:color="auto" w:val="clear"/>
-        </w:rPr>
-        <w:t xml:space="preserve">[within X days]</w:t>
-      </w:r>
-      <w:r>
-        <w:rPr>
-          <w:rFonts w:ascii="Arial" w:cs="Arial" w:eastAsia="Arial" w:hAnsi="Arial"/>
-        </w:rPr>
-        <w:t xml:space="preserve">.</w:t>
+        <w:t xml:space="preserve">If you tell us to leave your order in a </w:t>
+      </w:r>
+      <w:r>
+        <w:rPr>
+          <w:rFonts w:ascii="Arial" w:cs="Arial" w:eastAsia="Arial" w:hAnsi="Arial"/>
+          <w:b/>
+          <w:bCs/>
+        </w:rPr>
+        <w:t xml:space="preserve">particular spot</w:t>
+      </w:r>
+      <w:r>
+        <w:rPr>
+          <w:rFonts w:ascii="Arial" w:cs="Arial" w:eastAsia="Arial" w:hAnsi="Arial"/>
+        </w:rPr>
+        <w:t xml:space="preserve">, such as the garage or a locked gate, we will do our best. </w:t>
+      </w:r>
+      <w:r>
+        <w:rPr>
+          <w:rFonts w:ascii="Arial" w:cs="Arial" w:eastAsia="Arial" w:hAnsi="Arial"/>
+          <w:b/>
+          <w:bCs/>
+        </w:rPr>
+        <w:t xml:space="preserve">Once it has been left there, it is your responsibility.</w:t>
+      </w:r>
+      <w:r>
+        <w:rPr>
+          <w:rFonts w:ascii="Arial" w:cs="Arial" w:eastAsia="Arial" w:hAnsi="Arial"/>
+        </w:rPr>
+        <w:t xml:space="preserve"> We cannot be responsible for goods that go missing from a spot you nominated.</w:t>
       </w:r>
     </w:p>
     <w:p>
@@ -909,31 +1019,138 @@
         <w:rPr>
           <w:rFonts w:ascii="Arial" w:cs="Arial" w:eastAsia="Arial" w:hAnsi="Arial"/>
         </w:rPr>
-        <w:t xml:space="preserve">If anything is damaged or missing, contact us as soon as possible, with your order number and photos, at </w:t>
-      </w:r>
-      <w:r>
-        <w:rPr>
-          <w:rFonts w:ascii="Arial" w:cs="Arial" w:eastAsia="Arial" w:hAnsi="Arial"/>
+        <w:t xml:space="preserve">Please tell us if access is </w:t>
+      </w:r>
+      <w:r>
+        <w:rPr>
+          <w:rFonts w:ascii="Arial" w:cs="Arial" w:eastAsia="Arial" w:hAnsi="Arial"/>
+          <w:b/>
+          <w:bCs/>
+        </w:rPr>
+        <w:t xml:space="preserve">limited</w:t>
+      </w:r>
+      <w:r>
+        <w:rPr>
+          <w:rFonts w:ascii="Arial" w:cs="Arial" w:eastAsia="Arial" w:hAnsi="Arial"/>
+        </w:rPr>
+        <w:t xml:space="preserve"> - for example, a narrow driveway, steep driveway, gated property, or no room for a truck.</w:t>
+      </w:r>
+    </w:p>
+    <w:p>
+      <w:pPr>
+        <w:spacing w:after="160" w:line="300"/>
+      </w:pPr>
+      <w:r>
+        <w:rPr>
+          <w:rFonts w:ascii="Arial" w:cs="Arial" w:eastAsia="Arial" w:hAnsi="Arial"/>
+          <w:b/>
+          <w:bCs/>
+        </w:rPr>
+        <w:t xml:space="preserve">When a delivery cannot be completed:</w:t>
+      </w:r>
+      <w:r>
+        <w:rPr>
+          <w:rFonts w:ascii="Arial" w:cs="Arial" w:eastAsia="Arial" w:hAnsi="Arial"/>
+        </w:rPr>
+        <w:t xml:space="preserve"> if the courier cannot deliver because of an </w:t>
+      </w:r>
+      <w:r>
+        <w:rPr>
+          <w:rFonts w:ascii="Arial" w:cs="Arial" w:eastAsia="Arial" w:hAnsi="Arial"/>
+          <w:b/>
+          <w:bCs/>
+        </w:rPr>
+        <w:t xml:space="preserve">incorrect address</w:t>
+      </w:r>
+      <w:r>
+        <w:rPr>
+          <w:rFonts w:ascii="Arial" w:cs="Arial" w:eastAsia="Arial" w:hAnsi="Arial"/>
+        </w:rPr>
+        <w:t xml:space="preserve">, </w:t>
+      </w:r>
+      <w:r>
+        <w:rPr>
+          <w:rFonts w:ascii="Arial" w:cs="Arial" w:eastAsia="Arial" w:hAnsi="Arial"/>
+          <w:b/>
+          <w:bCs/>
+        </w:rPr>
+        <w:t xml:space="preserve">nobody being available</w:t>
+      </w:r>
+      <w:r>
+        <w:rPr>
+          <w:rFonts w:ascii="Arial" w:cs="Arial" w:eastAsia="Arial" w:hAnsi="Arial"/>
+        </w:rPr>
+        <w:t xml:space="preserve">, or </w:t>
+      </w:r>
+      <w:r>
+        <w:rPr>
+          <w:rFonts w:ascii="Arial" w:cs="Arial" w:eastAsia="Arial" w:hAnsi="Arial"/>
+          <w:b/>
+          <w:bCs/>
+        </w:rPr>
+        <w:t xml:space="preserve">restricted access</w:t>
+      </w:r>
+      <w:r>
+        <w:rPr>
+          <w:rFonts w:ascii="Arial" w:cs="Arial" w:eastAsia="Arial" w:hAnsi="Arial"/>
+        </w:rPr>
+        <w:t xml:space="preserve">, we may charge a </w:t>
+      </w:r>
+      <w:r>
+        <w:rPr>
+          <w:rFonts w:ascii="Arial" w:cs="Arial" w:eastAsia="Arial" w:hAnsi="Arial"/>
+          <w:b/>
+          <w:bCs/>
+        </w:rPr>
+        <w:t xml:space="preserve">redelivery fee</w:t>
+      </w:r>
+      <w:r>
+        <w:rPr>
+          <w:rFonts w:ascii="Arial" w:cs="Arial" w:eastAsia="Arial" w:hAnsi="Arial"/>
+        </w:rPr>
+        <w:t xml:space="preserve">, and the delivery must be paid for before we try again. If you ask us to </w:t>
+      </w:r>
+      <w:r>
+        <w:rPr>
+          <w:rFonts w:ascii="Arial" w:cs="Arial" w:eastAsia="Arial" w:hAnsi="Arial"/>
+          <w:b/>
+          <w:bCs/>
+        </w:rPr>
+        <w:t xml:space="preserve">redirect</w:t>
+      </w:r>
+      <w:r>
+        <w:rPr>
+          <w:rFonts w:ascii="Arial" w:cs="Arial" w:eastAsia="Arial" w:hAnsi="Arial"/>
+        </w:rPr>
+        <w:t xml:space="preserve"> an order to a different address after it has been dispatched, extra charges may apply. </w:t>
+      </w:r>
+      <w:r>
+        <w:rPr>
+          <w:rFonts w:ascii="Arial" w:cs="Arial" w:eastAsia="Arial" w:hAnsi="Arial"/>
+          <w:b/>
+          <w:bCs/>
           <w:shd w:fill="FFF2B3" w:color="auto" w:val="clear"/>
         </w:rPr>
-        <w:t xml:space="preserve">[BUSINESS EMAIL]</w:t>
-      </w:r>
-      <w:r>
-        <w:rPr>
-          <w:rFonts w:ascii="Arial" w:cs="Arial" w:eastAsia="Arial" w:hAnsi="Arial"/>
-        </w:rPr>
-        <w:t xml:space="preserve"> or +61 431 533 520.</w:t>
-      </w:r>
-    </w:p>
-    <w:p>
-      <w:pPr>
-        <w:spacing w:after="160" w:line="300"/>
-      </w:pPr>
-      <w:r>
-        <w:rPr>
-          <w:rFonts w:ascii="Arial" w:cs="Arial" w:eastAsia="Arial" w:hAnsi="Arial"/>
-        </w:rPr>
-        <w:t xml:space="preserve">We will arrange a replacement, repair or refund as required by law. See our Warranty Policy and the returns and refunds information on our FAQs page.</w:t>
+        <w:t xml:space="preserve">[CONFIRM redelivery charge approach.]</w:t>
+      </w:r>
+    </w:p>
+    <w:p>
+      <w:pPr>
+        <w:spacing w:after="160" w:line="300"/>
+      </w:pPr>
+      <w:r>
+        <w:rPr>
+          <w:rFonts w:ascii="Arial" w:cs="Arial" w:eastAsia="Arial" w:hAnsi="Arial"/>
+          <w:b/>
+          <w:bCs/>
+        </w:rPr>
+        <w:t xml:space="preserve">If we cannot deliver to your address at all,</w:t>
+      </w:r>
+      <w:r>
+        <w:rPr>
+          <w:rFonts w:ascii="Arial" w:cs="Arial" w:eastAsia="Arial" w:hAnsi="Arial"/>
+        </w:rPr>
+        <w:t xml:space="preserve"> we will contact you to talk about options - for example, collecting your order, paying an extra fee, or a refund of the delivery fee so you can organise your own freight. If none of these work, we will give you a full refund.</w:t>
       </w:r>
     </w:p>
     <w:p>
@@ -950,18 +1167,177 @@
           <w:sz w:val="26"/>
           <w:szCs w:val="26"/>
         </w:rPr>
-        <w:t xml:space="preserve">8. Risk and ownership</w:t>
-      </w:r>
-    </w:p>
-    <w:p>
-      <w:pPr>
-        <w:spacing w:after="160" w:line="300"/>
-      </w:pPr>
-      <w:r>
-        <w:rPr>
-          <w:rFonts w:ascii="Arial" w:cs="Arial" w:eastAsia="Arial" w:hAnsi="Arial"/>
-        </w:rPr>
-        <w:t xml:space="preserve">Risk in the goods passes to you when they are delivered to you or collected. Ownership passes to you once we have received full payment.</w:t>
+        <w:t xml:space="preserve">7. Check your order on arrival</w:t>
+      </w:r>
+    </w:p>
+    <w:p>
+      <w:pPr>
+        <w:spacing w:after="160" w:line="300"/>
+      </w:pPr>
+      <w:r>
+        <w:rPr>
+          <w:rFonts w:ascii="Arial" w:cs="Arial" w:eastAsia="Arial" w:hAnsi="Arial"/>
+        </w:rPr>
+        <w:t xml:space="preserve">Please check your order when it arrives:</w:t>
+      </w:r>
+    </w:p>
+    <w:p>
+      <w:pPr>
+        <w:pStyle w:val="ListParagraph"/>
+        <w:numPr>
+          <w:ilvl w:val="0"/>
+          <w:numId w:val="3"/>
+        </w:numPr>
+        <w:spacing w:after="100" w:line="300"/>
+      </w:pPr>
+      <w:r>
+        <w:rPr>
+          <w:rFonts w:ascii="Arial" w:cs="Arial" w:eastAsia="Arial" w:hAnsi="Arial"/>
+        </w:rPr>
+        <w:t xml:space="preserve">Look over the outside of the boxes for damage </w:t>
+      </w:r>
+      <w:r>
+        <w:rPr>
+          <w:rFonts w:ascii="Arial" w:cs="Arial" w:eastAsia="Arial" w:hAnsi="Arial"/>
+          <w:b/>
+          <w:bCs/>
+        </w:rPr>
+        <w:t xml:space="preserve">before</w:t>
+      </w:r>
+      <w:r>
+        <w:rPr>
+          <w:rFonts w:ascii="Arial" w:cs="Arial" w:eastAsia="Arial" w:hAnsi="Arial"/>
+        </w:rPr>
+        <w:t xml:space="preserve"> the courier leaves where you can, and take photos.</w:t>
+      </w:r>
+    </w:p>
+    <w:p>
+      <w:pPr>
+        <w:pStyle w:val="ListParagraph"/>
+        <w:numPr>
+          <w:ilvl w:val="0"/>
+          <w:numId w:val="3"/>
+        </w:numPr>
+        <w:spacing w:after="100" w:line="300"/>
+      </w:pPr>
+      <w:r>
+        <w:rPr>
+          <w:rFonts w:ascii="Arial" w:cs="Arial" w:eastAsia="Arial" w:hAnsi="Arial"/>
+        </w:rPr>
+        <w:t xml:space="preserve">Open the boxes and check you have received everything.</w:t>
+      </w:r>
+    </w:p>
+    <w:p>
+      <w:pPr>
+        <w:pStyle w:val="ListParagraph"/>
+        <w:numPr>
+          <w:ilvl w:val="0"/>
+          <w:numId w:val="3"/>
+        </w:numPr>
+        <w:spacing w:after="100" w:line="300"/>
+      </w:pPr>
+      <w:r>
+        <w:rPr>
+          <w:rFonts w:ascii="Arial" w:cs="Arial" w:eastAsia="Arial" w:hAnsi="Arial"/>
+        </w:rPr>
+        <w:t xml:space="preserve">If anything is damaged, missing or wrong, contact us as soon as possible - </w:t>
+      </w:r>
+      <w:r>
+        <w:rPr>
+          <w:rFonts w:ascii="Arial" w:cs="Arial" w:eastAsia="Arial" w:hAnsi="Arial"/>
+          <w:b/>
+          <w:bCs/>
+        </w:rPr>
+        <w:t xml:space="preserve">ideally within 7 days of delivery</w:t>
+      </w:r>
+      <w:r>
+        <w:rPr>
+          <w:rFonts w:ascii="Arial" w:cs="Arial" w:eastAsia="Arial" w:hAnsi="Arial"/>
+        </w:rPr>
+        <w:t xml:space="preserve"> - at Edwin_10@live.com.au or +61 431 533 520. Please include your order number and </w:t>
+      </w:r>
+      <w:r>
+        <w:rPr>
+          <w:rFonts w:ascii="Arial" w:cs="Arial" w:eastAsia="Arial" w:hAnsi="Arial"/>
+          <w:b/>
+          <w:bCs/>
+        </w:rPr>
+        <w:t xml:space="preserve">photos</w:t>
+      </w:r>
+      <w:r>
+        <w:rPr>
+          <w:rFonts w:ascii="Arial" w:cs="Arial" w:eastAsia="Arial" w:hAnsi="Arial"/>
+        </w:rPr>
+        <w:t xml:space="preserve"> of the product, the damage, the packaging and the shipping label.</w:t>
+      </w:r>
+    </w:p>
+    <w:p>
+      <w:pPr>
+        <w:pStyle w:val="ListParagraph"/>
+        <w:numPr>
+          <w:ilvl w:val="0"/>
+          <w:numId w:val="3"/>
+        </w:numPr>
+        <w:spacing w:after="100" w:line="300"/>
+      </w:pPr>
+      <w:r>
+        <w:rPr>
+          <w:rFonts w:ascii="Arial" w:cs="Arial" w:eastAsia="Arial" w:hAnsi="Arial"/>
+        </w:rPr>
+        <w:t xml:space="preserve">Please </w:t>
+      </w:r>
+      <w:r>
+        <w:rPr>
+          <w:rFonts w:ascii="Arial" w:cs="Arial" w:eastAsia="Arial" w:hAnsi="Arial"/>
+          <w:b/>
+          <w:bCs/>
+        </w:rPr>
+        <w:t xml:space="preserve">keep the packaging</w:t>
+      </w:r>
+      <w:r>
+        <w:rPr>
+          <w:rFonts w:ascii="Arial" w:cs="Arial" w:eastAsia="Arial" w:hAnsi="Arial"/>
+        </w:rPr>
+        <w:t xml:space="preserve"> until the problem is sorted out.</w:t>
+      </w:r>
+    </w:p>
+    <w:p>
+      <w:pPr>
+        <w:spacing w:after="160" w:line="300"/>
+      </w:pPr>
+      <w:r>
+        <w:rPr>
+          <w:rFonts w:ascii="Arial" w:cs="Arial" w:eastAsia="Arial" w:hAnsi="Arial"/>
+        </w:rPr>
+        <w:t xml:space="preserve">This is a request, not a cut-off: it does not limit your rights under the Australian Consumer Law. We will arrange a repair, replacement or refund as the law requires. See our </w:t>
+      </w:r>
+      <w:r>
+        <w:rPr>
+          <w:rFonts w:ascii="Arial" w:cs="Arial" w:eastAsia="Arial" w:hAnsi="Arial"/>
+          <w:b/>
+          <w:bCs/>
+        </w:rPr>
+        <w:t xml:space="preserve">Returns Policy</w:t>
+      </w:r>
+      <w:r>
+        <w:rPr>
+          <w:rFonts w:ascii="Arial" w:cs="Arial" w:eastAsia="Arial" w:hAnsi="Arial"/>
+        </w:rPr>
+        <w:t xml:space="preserve"> (section 4) for faulty, damaged or incorrect items, and our </w:t>
+      </w:r>
+      <w:r>
+        <w:rPr>
+          <w:rFonts w:ascii="Arial" w:cs="Arial" w:eastAsia="Arial" w:hAnsi="Arial"/>
+          <w:b/>
+          <w:bCs/>
+        </w:rPr>
+        <w:t xml:space="preserve">Warranty Policy</w:t>
+      </w:r>
+      <w:r>
+        <w:rPr>
+          <w:rFonts w:ascii="Arial" w:cs="Arial" w:eastAsia="Arial" w:hAnsi="Arial"/>
+        </w:rPr>
+        <w:t xml:space="preserve"> for cover after delivery.</w:t>
       </w:r>
     </w:p>
     <w:p>
@@ -978,6 +1354,34 @@
           <w:sz w:val="26"/>
           <w:szCs w:val="26"/>
         </w:rPr>
+        <w:t xml:space="preserve">8. Risk and ownership</w:t>
+      </w:r>
+    </w:p>
+    <w:p>
+      <w:pPr>
+        <w:spacing w:after="160" w:line="300"/>
+      </w:pPr>
+      <w:r>
+        <w:rPr>
+          <w:rFonts w:ascii="Arial" w:cs="Arial" w:eastAsia="Arial" w:hAnsi="Arial"/>
+        </w:rPr>
+        <w:t xml:space="preserve">Risk in the goods passes to you when they are delivered to you or collected. Ownership passes to you once we have received full payment.</w:t>
+      </w:r>
+    </w:p>
+    <w:p>
+      <w:pPr>
+        <w:pStyle w:val="Heading2"/>
+        <w:keepNext/>
+        <w:spacing w:after="120" w:before="280"/>
+      </w:pPr>
+      <w:r>
+        <w:rPr>
+          <w:rFonts w:ascii="Arial" w:cs="Arial" w:eastAsia="Arial" w:hAnsi="Arial"/>
+          <w:b/>
+          <w:bCs/>
+          <w:sz w:val="26"/>
+          <w:szCs w:val="26"/>
+        </w:rPr>
         <w:t xml:space="preserve">9. Contact us</w:t>
       </w:r>
     </w:p>
@@ -1025,14 +1429,7 @@
         <w:rPr>
           <w:rFonts w:ascii="Arial" w:cs="Arial" w:eastAsia="Arial" w:hAnsi="Arial"/>
         </w:rPr>
-        <w:t xml:space="preserve">Email: </w:t>
-      </w:r>
-      <w:r>
-        <w:rPr>
-          <w:rFonts w:ascii="Arial" w:cs="Arial" w:eastAsia="Arial" w:hAnsi="Arial"/>
-          <w:shd w:fill="FFF2B3" w:color="auto" w:val="clear"/>
-        </w:rPr>
-        <w:t xml:space="preserve">[BUSINESS EMAIL]</w:t>
+        <w:t xml:space="preserve">Email: Edwin_10@live.com.au</w:t>
       </w:r>
     </w:p>
     <w:sectPr>
@@ -1246,6 +1643,15 @@
       <w:lvlJc w:val="left"/>
       <w:pPr>
         <w:ind w:left="720" w:hanging="360"/>
+      </w:pPr>
+    </w:lvl>
+    <w:lvl w:ilvl="1" w:tentative="1">
+      <w:start w:val="1"/>
+      <w:numFmt w:val="bullet"/>
+      <w:lvlText w:val="–"/>
+      <w:lvlJc w:val="left"/>
+      <w:pPr>
+        <w:ind w:left="1260" w:hanging="360"/>
       </w:pPr>
     </w:lvl>
   </w:abstractNum>

</xml_diff>

<commit_message>
Delivery policy v3: walk-in pickup, 7-day hold, carry-in via courier, redelivery fee
Co-Authored-By: Claude Sonnet 5.5 <noreply@anthropic.com>
</commit_message>
<xml_diff>
--- a/docs/policy-drafts/delivery-policy.docx
+++ b/docs/policy-drafts/delivery-policy.docx
@@ -35,7 +35,7 @@
           <w:sz w:val="20"/>
           <w:szCs w:val="20"/>
         </w:rPr>
-        <w:t xml:space="preserve">Draft for review (version 2).</w:t>
+        <w:t xml:space="preserve">Draft for review (version 3).</w:t>
       </w:r>
       <w:r>
         <w:rPr>
@@ -295,30 +295,35 @@
         <w:rPr>
           <w:rFonts w:ascii="Arial" w:cs="Arial" w:eastAsia="Arial" w:hAnsi="Arial"/>
         </w:rPr>
-        <w:t xml:space="preserve">We will email you when your order is </w:t>
-      </w:r>
-      <w:r>
-        <w:rPr>
-          <w:rFonts w:ascii="Arial" w:cs="Arial" w:eastAsia="Arial" w:hAnsi="Arial"/>
-          <w:b/>
-          <w:bCs/>
-        </w:rPr>
-        <w:t xml:space="preserve">ready to collect</w:t>
-      </w:r>
-      <w:r>
-        <w:rPr>
-          <w:rFonts w:ascii="Arial" w:cs="Arial" w:eastAsia="Arial" w:hAnsi="Arial"/>
-        </w:rPr>
-        <w:t xml:space="preserve">. </w:t>
-      </w:r>
-      <w:r>
-        <w:rPr>
-          <w:rFonts w:ascii="Arial" w:cs="Arial" w:eastAsia="Arial" w:hAnsi="Arial"/>
-          <w:b/>
-          <w:bCs/>
-          <w:shd w:fill="FFF2B3" w:color="auto" w:val="clear"/>
-        </w:rPr>
-        <w:t xml:space="preserve">[CONFIRM: do you want pickup by appointment, and how long does an order take to be ready - for example 1 business day?]</w:t>
+        <w:t xml:space="preserve">Your order is </w:t>
+      </w:r>
+      <w:r>
+        <w:rPr>
+          <w:rFonts w:ascii="Arial" w:cs="Arial" w:eastAsia="Arial" w:hAnsi="Arial"/>
+          <w:b/>
+          <w:bCs/>
+        </w:rPr>
+        <w:t xml:space="preserve">ready straight away</w:t>
+      </w:r>
+      <w:r>
+        <w:rPr>
+          <w:rFonts w:ascii="Arial" w:cs="Arial" w:eastAsia="Arial" w:hAnsi="Arial"/>
+        </w:rPr>
+        <w:t xml:space="preserve">. Once you have your order confirmation email, you can </w:t>
+      </w:r>
+      <w:r>
+        <w:rPr>
+          <w:rFonts w:ascii="Arial" w:cs="Arial" w:eastAsia="Arial" w:hAnsi="Arial"/>
+          <w:b/>
+          <w:bCs/>
+        </w:rPr>
+        <w:t xml:space="preserve">walk in and collect it during our opening hours</w:t>
+      </w:r>
+      <w:r>
+        <w:rPr>
+          <w:rFonts w:ascii="Arial" w:cs="Arial" w:eastAsia="Arial" w:hAnsi="Arial"/>
+        </w:rPr>
+        <w:t xml:space="preserve"> - no appointment needed.</w:t>
       </w:r>
     </w:p>
     <w:p>
@@ -334,21 +339,21 @@
         <w:rPr>
           <w:rFonts w:ascii="Arial" w:cs="Arial" w:eastAsia="Arial" w:hAnsi="Arial"/>
         </w:rPr>
-        <w:t xml:space="preserve">Bring a copy of your </w:t>
-      </w:r>
-      <w:r>
-        <w:rPr>
-          <w:rFonts w:ascii="Arial" w:cs="Arial" w:eastAsia="Arial" w:hAnsi="Arial"/>
-          <w:b/>
-          <w:bCs/>
-        </w:rPr>
-        <w:t xml:space="preserve">order confirmation</w:t>
-      </w:r>
-      <w:r>
-        <w:rPr>
-          <w:rFonts w:ascii="Arial" w:cs="Arial" w:eastAsia="Arial" w:hAnsi="Arial"/>
-        </w:rPr>
-        <w:t xml:space="preserve"> or your order number when you arrive.</w:t>
+        <w:t xml:space="preserve">Bring your </w:t>
+      </w:r>
+      <w:r>
+        <w:rPr>
+          <w:rFonts w:ascii="Arial" w:cs="Arial" w:eastAsia="Arial" w:hAnsi="Arial"/>
+          <w:b/>
+          <w:bCs/>
+        </w:rPr>
+        <w:t xml:space="preserve">order confirmation email</w:t>
+      </w:r>
+      <w:r>
+        <w:rPr>
+          <w:rFonts w:ascii="Arial" w:cs="Arial" w:eastAsia="Arial" w:hAnsi="Arial"/>
+        </w:rPr>
+        <w:t xml:space="preserve"> (or your order number) when you arrive. No photo ID is needed.</w:t>
       </w:r>
     </w:p>
     <w:p>
@@ -364,7 +369,57 @@
         <w:rPr>
           <w:rFonts w:ascii="Arial" w:cs="Arial" w:eastAsia="Arial" w:hAnsi="Arial"/>
         </w:rPr>
-        <w:t xml:space="preserve">If someone else is collecting for you, they will need your order number. </w:t>
+        <w:t xml:space="preserve">If someone else is collecting for you, they need the same order confirmation email.</w:t>
+      </w:r>
+    </w:p>
+    <w:p>
+      <w:pPr>
+        <w:spacing w:after="160" w:line="300"/>
+      </w:pPr>
+      <w:r>
+        <w:rPr>
+          <w:rFonts w:ascii="Arial" w:cs="Arial" w:eastAsia="Arial" w:hAnsi="Arial"/>
+        </w:rPr>
+        <w:t xml:space="preserve">If you arranged to pay by </w:t>
+      </w:r>
+      <w:r>
+        <w:rPr>
+          <w:rFonts w:ascii="Arial" w:cs="Arial" w:eastAsia="Arial" w:hAnsi="Arial"/>
+          <w:b/>
+          <w:bCs/>
+        </w:rPr>
+        <w:t xml:space="preserve">bank transfer, PayID or cash</w:t>
+      </w:r>
+      <w:r>
+        <w:rPr>
+          <w:rFonts w:ascii="Arial" w:cs="Arial" w:eastAsia="Arial" w:hAnsi="Arial"/>
+        </w:rPr>
+        <w:t xml:space="preserve"> for a pickup order, you pay in person at our pickup location when you collect.</w:t>
+      </w:r>
+    </w:p>
+    <w:p>
+      <w:pPr>
+        <w:spacing w:after="160" w:line="300"/>
+      </w:pPr>
+      <w:r>
+        <w:rPr>
+          <w:rFonts w:ascii="Arial" w:cs="Arial" w:eastAsia="Arial" w:hAnsi="Arial"/>
+        </w:rPr>
+        <w:t xml:space="preserve">Your shelving is packed flat in boxes. Our How To Collect In Your Vehicle guide shows boxed sizes and weights so you can check your vehicle first. You are also welcome to send your own courier to collect your order. Please contact us in advance so we can arrange it. We hold pickup orders for </w:t>
+      </w:r>
+      <w:r>
+        <w:rPr>
+          <w:rFonts w:ascii="Arial" w:cs="Arial" w:eastAsia="Arial" w:hAnsi="Arial"/>
+          <w:b/>
+          <w:bCs/>
+        </w:rPr>
+        <w:t xml:space="preserve">7 days</w:t>
+      </w:r>
+      <w:r>
+        <w:rPr>
+          <w:rFonts w:ascii="Arial" w:cs="Arial" w:eastAsia="Arial" w:hAnsi="Arial"/>
+        </w:rPr>
+        <w:t xml:space="preserve">. If you cannot collect within 7 days, please contact us. </w:t>
       </w:r>
       <w:r>
         <w:rPr>
@@ -373,52 +428,7 @@
           <w:bCs/>
           <w:shd w:fill="FFF2B3" w:color="auto" w:val="clear"/>
         </w:rPr>
-        <w:t xml:space="preserve">[CONFIRM: any ID requirement?]</w:t>
-      </w:r>
-    </w:p>
-    <w:p>
-      <w:pPr>
-        <w:spacing w:after="160" w:line="300"/>
-      </w:pPr>
-      <w:r>
-        <w:rPr>
-          <w:rFonts w:ascii="Arial" w:cs="Arial" w:eastAsia="Arial" w:hAnsi="Arial"/>
-        </w:rPr>
-        <w:t xml:space="preserve">If you arranged to pay by </w:t>
-      </w:r>
-      <w:r>
-        <w:rPr>
-          <w:rFonts w:ascii="Arial" w:cs="Arial" w:eastAsia="Arial" w:hAnsi="Arial"/>
-          <w:b/>
-          <w:bCs/>
-        </w:rPr>
-        <w:t xml:space="preserve">bank transfer, PayID or cash</w:t>
-      </w:r>
-      <w:r>
-        <w:rPr>
-          <w:rFonts w:ascii="Arial" w:cs="Arial" w:eastAsia="Arial" w:hAnsi="Arial"/>
-        </w:rPr>
-        <w:t xml:space="preserve"> for a pickup order, you pay in person at our pickup location when you collect.</w:t>
-      </w:r>
-    </w:p>
-    <w:p>
-      <w:pPr>
-        <w:spacing w:after="160" w:line="300"/>
-      </w:pPr>
-      <w:r>
-        <w:rPr>
-          <w:rFonts w:ascii="Arial" w:cs="Arial" w:eastAsia="Arial" w:hAnsi="Arial"/>
-        </w:rPr>
-        <w:t xml:space="preserve">Your shelving is packed flat in boxes. Our How To Collect In Your Vehicle guide shows boxed sizes and weights so you can check your vehicle first. You are also welcome to send your own courier to collect your order. Please contact us in advance so we can arrange it. </w:t>
-      </w:r>
-      <w:r>
-        <w:rPr>
-          <w:rFonts w:ascii="Arial" w:cs="Arial" w:eastAsia="Arial" w:hAnsi="Arial"/>
-          <w:b/>
-          <w:bCs/>
-          <w:shd w:fill="FFF2B3" w:color="auto" w:val="clear"/>
-        </w:rPr>
-        <w:t xml:space="preserve">[CONFIRM: how long you hold pickup orders before they go back to stock, for example 14 days.]</w:t>
+        <w:t xml:space="preserve">[CONFIRM: what happens after 7 days with no contact - for example, we return the order to stock and refund the purchase price, less any fees.]</w:t>
       </w:r>
     </w:p>
     <w:p>
@@ -549,30 +559,21 @@
         <w:rPr>
           <w:rFonts w:ascii="Arial" w:cs="Arial" w:eastAsia="Arial" w:hAnsi="Arial"/>
         </w:rPr>
-        <w:t xml:space="preserve">We will try to meet any delivery time you ask for, but we </w:t>
-      </w:r>
-      <w:r>
-        <w:rPr>
-          <w:rFonts w:ascii="Arial" w:cs="Arial" w:eastAsia="Arial" w:hAnsi="Arial"/>
-          <w:b/>
-          <w:bCs/>
-        </w:rPr>
-        <w:t xml:space="preserve">cannot guarantee a specific day, time or time slot</w:t>
-      </w:r>
-      <w:r>
-        <w:rPr>
-          <w:rFonts w:ascii="Arial" w:cs="Arial" w:eastAsia="Arial" w:hAnsi="Arial"/>
-        </w:rPr>
-        <w:t xml:space="preserve"> unless we have confirmed it in writing. </w:t>
-      </w:r>
-      <w:r>
-        <w:rPr>
-          <w:rFonts w:ascii="Arial" w:cs="Arial" w:eastAsia="Arial" w:hAnsi="Arial"/>
-          <w:b/>
-          <w:bCs/>
-          <w:shd w:fill="FFF2B3" w:color="auto" w:val="clear"/>
-        </w:rPr>
-        <w:t xml:space="preserve">[CONFIRM: whether you offer a booked time slot for an extra fee.]</w:t>
+        <w:t xml:space="preserve">We </w:t>
+      </w:r>
+      <w:r>
+        <w:rPr>
+          <w:rFonts w:ascii="Arial" w:cs="Arial" w:eastAsia="Arial" w:hAnsi="Arial"/>
+          <w:b/>
+          <w:bCs/>
+        </w:rPr>
+        <w:t xml:space="preserve">cannot book a specific day, time or time slot</w:t>
+      </w:r>
+      <w:r>
+        <w:rPr>
+          <w:rFonts w:ascii="Arial" w:cs="Arial" w:eastAsia="Arial" w:hAnsi="Arial"/>
+        </w:rPr>
+        <w:t xml:space="preserve"> for delivery. Delivery dates and times are set by the courier or our delivery team, so please make sure someone can receive your order or tell us a safe spot to leave it.</w:t>
       </w:r>
     </w:p>
     <w:p>
@@ -773,7 +774,7 @@
           <w:b/>
           <w:bCs/>
         </w:rPr>
-        <w:t xml:space="preserve">within 2 business days</w:t>
+        <w:t xml:space="preserve">as soon as we can</w:t>
       </w:r>
       <w:r>
         <w:rPr>
@@ -890,21 +891,35 @@
         <w:rPr>
           <w:rFonts w:ascii="Arial" w:cs="Arial" w:eastAsia="Arial" w:hAnsi="Arial"/>
         </w:rPr>
-        <w:t xml:space="preserve"> of your address. </w:t>
-      </w:r>
-      <w:r>
-        <w:rPr>
-          <w:rFonts w:ascii="Arial" w:cs="Arial" w:eastAsia="Arial" w:hAnsi="Arial"/>
-          <w:b/>
-          <w:bCs/>
-        </w:rPr>
-        <w:t xml:space="preserve">We do not carry items upstairs, downstairs or inside</w:t>
-      </w:r>
-      <w:r>
-        <w:rPr>
-          <w:rFonts w:ascii="Arial" w:cs="Arial" w:eastAsia="Arial" w:hAnsi="Arial"/>
-        </w:rPr>
-        <w:t xml:space="preserve"> your home or business. </w:t>
+        <w:t xml:space="preserve"> of your address. Standard delivery does </w:t>
+      </w:r>
+      <w:r>
+        <w:rPr>
+          <w:rFonts w:ascii="Arial" w:cs="Arial" w:eastAsia="Arial" w:hAnsi="Arial"/>
+          <w:b/>
+          <w:bCs/>
+        </w:rPr>
+        <w:t xml:space="preserve">not</w:t>
+      </w:r>
+      <w:r>
+        <w:rPr>
+          <w:rFonts w:ascii="Arial" w:cs="Arial" w:eastAsia="Arial" w:hAnsi="Arial"/>
+        </w:rPr>
+        <w:t xml:space="preserve"> include carrying items upstairs, downstairs or inside your home or business. If you need that, you can </w:t>
+      </w:r>
+      <w:r>
+        <w:rPr>
+          <w:rFonts w:ascii="Arial" w:cs="Arial" w:eastAsia="Arial" w:hAnsi="Arial"/>
+          <w:b/>
+          <w:bCs/>
+        </w:rPr>
+        <w:t xml:space="preserve">arrange it separately with the courier when your order is delivered</w:t>
+      </w:r>
+      <w:r>
+        <w:rPr>
+          <w:rFonts w:ascii="Arial" w:cs="Arial" w:eastAsia="Arial" w:hAnsi="Arial"/>
+        </w:rPr>
+        <w:t xml:space="preserve">. </w:t>
       </w:r>
       <w:r>
         <w:rPr>
@@ -913,7 +928,7 @@
           <w:bCs/>
           <w:shd w:fill="FFF2B3" w:color="auto" w:val="clear"/>
         </w:rPr>
-        <w:t xml:space="preserve">[CONFIRM: or add "unless arranged in advance for an extra fee".]</w:t>
+        <w:t xml:space="preserve">[CONFIRM: any extra fee for carry-in is agreed with, and paid to, the courier.]</w:t>
       </w:r>
     </w:p>
     <w:p>
@@ -1094,7 +1109,7 @@
         <w:rPr>
           <w:rFonts w:ascii="Arial" w:cs="Arial" w:eastAsia="Arial" w:hAnsi="Arial"/>
         </w:rPr>
-        <w:t xml:space="preserve">, we may charge a </w:t>
+        <w:t xml:space="preserve">, we will charge a </w:t>
       </w:r>
       <w:r>
         <w:rPr>
@@ -1108,7 +1123,21 @@
         <w:rPr>
           <w:rFonts w:ascii="Arial" w:cs="Arial" w:eastAsia="Arial" w:hAnsi="Arial"/>
         </w:rPr>
-        <w:t xml:space="preserve">, and the delivery must be paid for before we try again. If you ask us to </w:t>
+        <w:t xml:space="preserve">, which is the </w:t>
+      </w:r>
+      <w:r>
+        <w:rPr>
+          <w:rFonts w:ascii="Arial" w:cs="Arial" w:eastAsia="Arial" w:hAnsi="Arial"/>
+          <w:b/>
+          <w:bCs/>
+        </w:rPr>
+        <w:t xml:space="preserve">same cost as the original delivery</w:t>
+      </w:r>
+      <w:r>
+        <w:rPr>
+          <w:rFonts w:ascii="Arial" w:cs="Arial" w:eastAsia="Arial" w:hAnsi="Arial"/>
+        </w:rPr>
+        <w:t xml:space="preserve">. It must be paid before we try again. If you ask us to </w:t>
       </w:r>
       <w:r>
         <w:rPr>
@@ -1122,16 +1151,7 @@
         <w:rPr>
           <w:rFonts w:ascii="Arial" w:cs="Arial" w:eastAsia="Arial" w:hAnsi="Arial"/>
         </w:rPr>
-        <w:t xml:space="preserve"> an order to a different address after it has been dispatched, extra charges may apply. </w:t>
-      </w:r>
-      <w:r>
-        <w:rPr>
-          <w:rFonts w:ascii="Arial" w:cs="Arial" w:eastAsia="Arial" w:hAnsi="Arial"/>
-          <w:b/>
-          <w:bCs/>
-          <w:shd w:fill="FFF2B3" w:color="auto" w:val="clear"/>
-        </w:rPr>
-        <w:t xml:space="preserve">[CONFIRM redelivery charge approach.]</w:t>
+        <w:t xml:space="preserve"> an order to a different address after it has been dispatched, extra charges may apply.</w:t>
       </w:r>
     </w:p>
     <w:p>

</xml_diff>

<commit_message>
Delivery policy v4: courier carry-in fee wording; keep extra freight cost clause
Co-Authored-By: Claude Sonnet 5.5 <noreply@anthropic.com>
</commit_message>
<xml_diff>
--- a/docs/policy-drafts/delivery-policy.docx
+++ b/docs/policy-drafts/delivery-policy.docx
@@ -35,7 +35,7 @@
           <w:sz w:val="20"/>
           <w:szCs w:val="20"/>
         </w:rPr>
-        <w:t xml:space="preserve">Draft for review (version 3).</w:t>
+        <w:t xml:space="preserve">Draft for review (version 4).</w:t>
       </w:r>
       <w:r>
         <w:rPr>
@@ -780,16 +780,7 @@
         <w:rPr>
           <w:rFonts w:ascii="Arial" w:cs="Arial" w:eastAsia="Arial" w:hAnsi="Arial"/>
         </w:rPr>
-        <w:t xml:space="preserve"> to discuss. You can accept the extra cost or cancel for a full refund. </w:t>
-      </w:r>
-      <w:r>
-        <w:rPr>
-          <w:rFonts w:ascii="Arial" w:cs="Arial" w:eastAsia="Arial" w:hAnsi="Arial"/>
-          <w:b/>
-          <w:bCs/>
-          <w:shd w:fill="FFF2B3" w:color="auto" w:val="clear"/>
-        </w:rPr>
-        <w:t xml:space="preserve">[CONFIRM: this is borrowed from another retailer's approach - keep it only if you want it.]</w:t>
+        <w:t xml:space="preserve"> to discuss. You can accept the extra cost or cancel for a full refund.</w:t>
       </w:r>
     </w:p>
     <w:p>
@@ -919,16 +910,7 @@
         <w:rPr>
           <w:rFonts w:ascii="Arial" w:cs="Arial" w:eastAsia="Arial" w:hAnsi="Arial"/>
         </w:rPr>
-        <w:t xml:space="preserve">. </w:t>
-      </w:r>
-      <w:r>
-        <w:rPr>
-          <w:rFonts w:ascii="Arial" w:cs="Arial" w:eastAsia="Arial" w:hAnsi="Arial"/>
-          <w:b/>
-          <w:bCs/>
-          <w:shd w:fill="FFF2B3" w:color="auto" w:val="clear"/>
-        </w:rPr>
-        <w:t xml:space="preserve">[CONFIRM: any extra fee for carry-in is agreed with, and paid to, the courier.]</w:t>
+        <w:t xml:space="preserve">. The courier may charge a fee for this, which you agree with and pay to them directly.</w:t>
       </w:r>
     </w:p>
     <w:p>

</xml_diff>

<commit_message>
Delivery policy v5: 14-day pickup hold, reminder email, 50% retained on uncollected orders
Co-Authored-By: Claude Sonnet 5.5 <noreply@anthropic.com>
</commit_message>
<xml_diff>
--- a/docs/policy-drafts/delivery-policy.docx
+++ b/docs/policy-drafts/delivery-policy.docx
@@ -35,7 +35,7 @@
           <w:sz w:val="20"/>
           <w:szCs w:val="20"/>
         </w:rPr>
-        <w:t xml:space="preserve">Draft for review (version 4).</w:t>
+        <w:t xml:space="preserve">Draft for review (version 5).</w:t>
       </w:r>
       <w:r>
         <w:rPr>
@@ -405,21 +405,82 @@
         <w:rPr>
           <w:rFonts w:ascii="Arial" w:cs="Arial" w:eastAsia="Arial" w:hAnsi="Arial"/>
         </w:rPr>
-        <w:t xml:space="preserve">Your shelving is packed flat in boxes. Our How To Collect In Your Vehicle guide shows boxed sizes and weights so you can check your vehicle first. You are also welcome to send your own courier to collect your order. Please contact us in advance so we can arrange it. We hold pickup orders for </w:t>
-      </w:r>
-      <w:r>
-        <w:rPr>
-          <w:rFonts w:ascii="Arial" w:cs="Arial" w:eastAsia="Arial" w:hAnsi="Arial"/>
-          <w:b/>
-          <w:bCs/>
-        </w:rPr>
-        <w:t xml:space="preserve">7 days</w:t>
-      </w:r>
-      <w:r>
-        <w:rPr>
-          <w:rFonts w:ascii="Arial" w:cs="Arial" w:eastAsia="Arial" w:hAnsi="Arial"/>
-        </w:rPr>
-        <w:t xml:space="preserve">. If you cannot collect within 7 days, please contact us. </w:t>
+        <w:t xml:space="preserve">Your shelving is packed flat in boxes. Our How To Collect In Your Vehicle guide shows boxed sizes and weights so you can check your vehicle first. You are also welcome to send your own courier to collect your order. Please contact us in advance so we can arrange it.</w:t>
+      </w:r>
+    </w:p>
+    <w:p>
+      <w:pPr>
+        <w:spacing w:after="160" w:line="300"/>
+      </w:pPr>
+      <w:r>
+        <w:rPr>
+          <w:rFonts w:ascii="Arial" w:cs="Arial" w:eastAsia="Arial" w:hAnsi="Arial"/>
+          <w:b/>
+          <w:bCs/>
+        </w:rPr>
+        <w:t xml:space="preserve">Uncollected orders:</w:t>
+      </w:r>
+      <w:r>
+        <w:rPr>
+          <w:rFonts w:ascii="Arial" w:cs="Arial" w:eastAsia="Arial" w:hAnsi="Arial"/>
+        </w:rPr>
+        <w:t xml:space="preserve"> we hold pickup orders for </w:t>
+      </w:r>
+      <w:r>
+        <w:rPr>
+          <w:rFonts w:ascii="Arial" w:cs="Arial" w:eastAsia="Arial" w:hAnsi="Arial"/>
+          <w:b/>
+          <w:bCs/>
+        </w:rPr>
+        <w:t xml:space="preserve">14 days</w:t>
+      </w:r>
+      <w:r>
+        <w:rPr>
+          <w:rFonts w:ascii="Arial" w:cs="Arial" w:eastAsia="Arial" w:hAnsi="Arial"/>
+        </w:rPr>
+        <w:t xml:space="preserve"> from your order confirmation. We will email you a </w:t>
+      </w:r>
+      <w:r>
+        <w:rPr>
+          <w:rFonts w:ascii="Arial" w:cs="Arial" w:eastAsia="Arial" w:hAnsi="Arial"/>
+          <w:b/>
+          <w:bCs/>
+        </w:rPr>
+        <w:t xml:space="preserve">reminder</w:t>
+      </w:r>
+      <w:r>
+        <w:rPr>
+          <w:rFonts w:ascii="Arial" w:cs="Arial" w:eastAsia="Arial" w:hAnsi="Arial"/>
+        </w:rPr>
+        <w:t xml:space="preserve"> after your order confirmation and "ready for pickup" email, so you have plenty of notice. If your order has not been collected within the 14 days, we will treat it as cancelled, keep </w:t>
+      </w:r>
+      <w:r>
+        <w:rPr>
+          <w:rFonts w:ascii="Arial" w:cs="Arial" w:eastAsia="Arial" w:hAnsi="Arial"/>
+          <w:b/>
+          <w:bCs/>
+        </w:rPr>
+        <w:t xml:space="preserve">50% of the purchase price</w:t>
+      </w:r>
+      <w:r>
+        <w:rPr>
+          <w:rFonts w:ascii="Arial" w:cs="Arial" w:eastAsia="Arial" w:hAnsi="Arial"/>
+        </w:rPr>
+        <w:t xml:space="preserve">, and refund the remaining 50%. If you cannot collect in time, please contact us </w:t>
+      </w:r>
+      <w:r>
+        <w:rPr>
+          <w:rFonts w:ascii="Arial" w:cs="Arial" w:eastAsia="Arial" w:hAnsi="Arial"/>
+          <w:b/>
+          <w:bCs/>
+        </w:rPr>
+        <w:t xml:space="preserve">before the 14 days are up</w:t>
+      </w:r>
+      <w:r>
+        <w:rPr>
+          <w:rFonts w:ascii="Arial" w:cs="Arial" w:eastAsia="Arial" w:hAnsi="Arial"/>
+        </w:rPr>
+        <w:t xml:space="preserve"> so we can work something out. </w:t>
       </w:r>
       <w:r>
         <w:rPr>
@@ -428,7 +489,7 @@
           <w:bCs/>
           <w:shd w:fill="FFF2B3" w:color="auto" w:val="clear"/>
         </w:rPr>
-        <w:t xml:space="preserve">[CONFIRM: what happens after 7 days with no contact - for example, we return the order to stock and refund the purchase price, less any fees.]</w:t>
+        <w:t xml:space="preserve">[LAWYER TO CHECK: keeping 50% of the price is much higher than the 20% restocking fee in the Returns Policy. It is easier to defend if the notice and reminder are clear, but a fee well above your real costs can be challenged as unfair, so confirm the percentage.]</w:t>
       </w:r>
     </w:p>
     <w:p>

</xml_diff>